<commit_message>
Fix stale test count and reuse misattribution in Sachin's report
Both the report and readme.txt claimed 113 tests total (37 in
backend/dashboard); the actual, currently-passing count is 115 (39 in
backend/dashboard) verified directly against the live test suite.

readme.txt's REUSE section also claimed the shared pipeline architecture
was adapted from "this student's own prior projects earlier in this same
CA submission" -- that design pattern actually comes from other codebases,
not Sachin's own prior work, so the claim is corrected to disclose that
honestly, matching the standard already applied to the other reassigned
projects' reports.
</commit_message>
<xml_diff>
--- a/documents/Gundeti_Sachin_Reddy_X23432721/Gundeti_Sachin_Reddy_X23432721.docx
+++ b/documents/Gundeti_Sachin_Reddy_X23432721/Gundeti_Sachin_Reddy_X23432721.docx
@@ -712,7 +712,7 @@
         <w:pStyle w:val="BodyText"/>
       </w:pPr>
       <w:r>
-        <w:t xml:space="preserve">Beyond unit tests, a load-testing script bursts a configurable number of synthetic messages directly onto the real queue. It makes two assertions: first, that the queue depth is non-zero immediately after the burst, proving the messages genuinely reached SQS rather than being silently dropped; second, that the queue depth has either fully drained or measurably decreased within a timeout window. This second, timeout-tolerant check allows for the underlying Lambda concurrency ceiling without treating a slower-than-expected drain as a hard failure. This two-tier assertion pattern was deliberately chosen so that the load test remains a meaningful elasticity check without becoming flaky under normal, expected throughput variation. All four modules' test suites, 113 tests in total, pass against both the LocalStack-backed development environment and, where applicable, the real AWS deployment.</w:t>
+        <w:t xml:space="preserve">Beyond unit tests, a load-testing script bursts a configurable number of synthetic messages directly onto the real queue. It makes two assertions: first, that the queue depth is non-zero immediately after the burst, proving the messages genuinely reached SQS rather than being silently dropped; second, that the queue depth has either fully drained or measurably decreased within a timeout window. This second, timeout-tolerant check allows for the underlying Lambda concurrency ceiling without treating a slower-than-expected drain as a hard failure. This two-tier assertion pattern was deliberately chosen so that the load test remains a meaningful elasticity check without becoming flaky under normal, expected throughput variation. All four modules' test suites, 115 tests in total, pass against both the LocalStack-backed development environment and, where applicable, the real AWS deployment.</w:t>
       </w:r>
     </w:p>
     <w:p>
@@ -800,7 +800,7 @@
         <w:pStyle w:val="BodyText"/>
       </w:pPr>
       <w:r>
-        <w:t xml:space="preserve">Table II summarises the automated test suite as of the final verified deployment. All 113 tests pass against both the LocalStack-backed development environment and, for the parts of the suite that exercise real client-construction logic, the fixes verified against the real AWS deployment described in Section III-D.</w:t>
+        <w:t xml:space="preserve">Table II summarises the automated test suite as of the final verified deployment. All 115 tests pass against both the LocalStack-backed development environment and, for the parts of the suite that exercise real client-construction logic, the fixes verified against the real AWS deployment described in Section III-D.</w:t>
       </w:r>
     </w:p>
     <w:p>
@@ -1015,7 +1015,7 @@
               <w:pStyle w:val="tablecopy"/>
             </w:pPr>
             <w:r>
-              <w:t xml:space="preserve">37</w:t>
+              <w:t xml:space="preserve">39</w:t>
             </w:r>
           </w:p>
         </w:tc>

</xml_diff>